<commit_message>
Hal11/12 update: embed Hal11 & Hal12 asli scans baru 1.2MB/460KB
Hal11 page hal_11.png 1.2MB + Hal12 hal_12.png 460KB — wafaq 2×4/3×3 image now matches kitab asli (hal_12.png). Qāthi'atu tetap th (tho), fīsy-syafhati sy (syin). Ha=ه terkunci. Co-Authored-By: internal-model

Co-authored-by: arena-agent <297053741+arena-agent@users.noreply.github.com>
</commit_message>
<xml_diff>
--- a/REVISI_HAL11_FAIDAH_QATHIAH_1.docx
+++ b/REVISI_HAL11_FAIDAH_QATHIAH_1.docx
@@ -565,7 +565,59 @@
           <w:color w:val="1B5E20"/>
           <w:sz w:val="16"/>
         </w:rPr>
-        <w:t>→ Wafaq 2×4 ada di Halaman 12 (berikutnya) — lihat Hal12</w:t>
+        <w:t>→ Wafaq 2×4 ada di Halaman 12 (berikutnya)</w:t>
+      </w:r>
+    </w:p>
+    <w:p>
+      <w:pPr>
+        <w:jc w:val="center"/>
+      </w:pPr>
+      <w:r>
+        <w:drawing>
+          <wp:inline xmlns:a="http://schemas.openxmlformats.org/drawingml/2006/main" xmlns:pic="http://schemas.openxmlformats.org/drawingml/2006/picture">
+            <wp:extent cx="4389120" cy="3391593"/>
+            <wp:docPr id="1" name="Picture 1"/>
+            <wp:cNvGraphicFramePr>
+              <a:graphicFrameLocks noChangeAspect="1"/>
+            </wp:cNvGraphicFramePr>
+            <a:graphic>
+              <a:graphicData uri="http://schemas.openxmlformats.org/drawingml/2006/picture">
+                <pic:pic>
+                  <pic:nvPicPr>
+                    <pic:cNvPr id="0" name="hal_11.png"/>
+                    <pic:cNvPicPr/>
+                  </pic:nvPicPr>
+                  <pic:blipFill>
+                    <a:blip r:embed="rId11"/>
+                    <a:stretch>
+                      <a:fillRect/>
+                    </a:stretch>
+                  </pic:blipFill>
+                  <pic:spPr>
+                    <a:xfrm>
+                      <a:off x="0" y="0"/>
+                      <a:ext cx="4389120" cy="3391593"/>
+                    </a:xfrm>
+                    <a:prstGeom prst="rect"/>
+                  </pic:spPr>
+                </pic:pic>
+              </a:graphicData>
+            </a:graphic>
+          </wp:inline>
+        </w:drawing>
+      </w:r>
+    </w:p>
+    <w:p>
+      <w:pPr>
+        <w:jc w:val="center"/>
+      </w:pPr>
+      <w:r>
+        <w:rPr>
+          <w:i/>
+          <w:color w:val="666666"/>
+          <w:sz w:val="14"/>
+        </w:rPr>
+        <w:t>[Gambar: Hal 11 Asli — 5 ayat tartib — 1.2 MB — hal_11.png]</w:t>
       </w:r>
     </w:p>
     <w:sectPr>

</xml_diff>